<commit_message>
Add the figure legends and supplementary material to the anonymised manuscript
Eurosurveillance takes figures as separate files, so the legends in the
manuscript are the only place a reviewer reads what each figure shows. They
were missing: the legends live in _legends/figN.md and, for the supplementary
figure, inside _supplement.md, so a .docx built only from _prose.md silently
omitted all five.

Adds a "Figure legends" section (Quarto supplies the "Figure N." label when it
renders the PDF, so the .docx has to number them itself), the supplementary
figure legend relabelled from the old BJSM "Online supplemental figure 1"
wording, and the supplementary wastewater methods that document it.

Also picks up the author's Doc edit changing "Our own work" to "Other work",
which was a first-person self-identification in an anonymised manuscript.

Co-Authored-By: Claude Opus 5 <noreply@anthropic.com>
</commit_message>
<xml_diff>
--- a/submission/eurosurveillance/02_Manuscript_anonymised.docx
+++ b/submission/eurosurveillance/02_Manuscript_anonymised.docx
@@ -114,7 +114,7 @@
     </w:p>
     <w:p>
       <w:r>
-        <w:t>A behavior-independent environmental signal such as viral nucleic acid in air could reveal a virus in a shared space occupied by people with asymptomatic, pre-symptomatic, or unreported infections. Respiratory viruses have long been recoverable from indoor air, and high-flow bioaerosol sampling is now a practical surveillance tool [21]. In congregate living settings, air samplers in student-dormitory HVAC returns detected SARS-CoV-2 in most cases when a positive resident lived on the same floor [22], and school air sampling has captured SARS-CoV-2 during sustained classroom transmission [23], [24]. Sampling across a range of community settings in Belgium, including nurseries, schools, workplaces, and nursing homes, detected at least one of 29 respiratory pathogens in 85% of 341 air samples, and showed that detection rose with higher carbon dioxide concentrations and poorer natural ventilation [25]. In a Belgian daycare centre, weekly air sampling over a full year combined with untargeted metagenomics recovered respiratory, enteric, and skin-associated viruses in 40 of 42 samples, with seasonal viruses appearing at epidemiologically expected times and complete genomes reconstructed directly from air [26]. Our own work has detected viral nucleic acids in congregate settings such as schools and healthcare facilities [27] and at international airports [28].</w:t>
+        <w:t>A behavior-independent environmental signal such as viral nucleic acid in air could reveal a virus in a shared space occupied by people with asymptomatic, pre-symptomatic, or unreported infections. Respiratory viruses have long been recoverable from indoor air, and high-flow bioaerosol sampling is now a practical surveillance tool [21]. In congregate living settings, air samplers in student-dormitory HVAC returns detected SARS-CoV-2 in most cases when a positive resident lived on the same floor [22], and school air sampling has captured SARS-CoV-2 during sustained classroom transmission [23], [24]. Sampling across a range of community settings in Belgium, including nurseries, schools, workplaces, and nursing homes, detected at least one of 29 respiratory pathogens in 85% of 341 air samples, and showed that detection rose with higher carbon dioxide concentrations and poorer natural ventilation [25]. In a Belgian daycare centre, weekly air sampling over a full year combined with untargeted metagenomics recovered respiratory, enteric, and skin-associated viruses in 40 of 42 samples, with seasonal viruses appearing at epidemiologically expected times and complete genomes reconstructed directly from air [26]. Other work has detected viral nucleic acids in congregate settings such as schools and healthcare facilities [27] and at international airports [28].</w:t>
       </w:r>
     </w:p>
     <w:p>
@@ -470,6 +470,131 @@
     <w:p>
       <w:r>
         <w:t>Claude Opus 4.8 (high reasoning), Claude Opus 5 (high reasoning), and Codex Sol were used for background research, literature retrieval and review, manuscript text drafting and organization, data analysis and visualization, continuous integration of edits to produce the submitted versions of the text and figures, and adversarial simulated peer review. All model-generated content was independently verified and further edited by the co-authors, who take full responsibility for the work.</w:t>
+      </w:r>
+    </w:p>
+    <w:p>
+      <w:r>
+        <w:rPr>
+          <w:b/>
+        </w:rPr>
+        <w:t>Figure legends</w:t>
+      </w:r>
+    </w:p>
+    <w:p>
+      <w:r>
+        <w:rPr>
+          <w:b/>
+        </w:rPr>
+        <w:t>Figure 1.</w:t>
+      </w:r>
+      <w:r>
+        <w:t xml:space="preserve"> </w:t>
+      </w:r>
+      <w:r>
+        <w:rPr>
+          <w:b/>
+        </w:rPr>
+        <w:t>Respiratory-virus detections in team-space air samples across the 2026 FIFA World Cup™.</w:t>
+      </w:r>
+      <w:r>
+        <w:t xml:space="preserve"> Air was sampled continuously in Team Canada congregate spaces across five host cities from 3 June to 4 July 2026, and every filter was tested for SARS-CoV-2, influenza A, influenza B, and RSV. All cities are shown on a single continuous local-time axis. Rows are the four target viruses; each rectangle is up to 4 filters tested for one virus, drawn to its exact sampling window. The results from all rooms are merged within each city into a single rectangle. A box is blue if the virus was detected in any room (fill mapped to the lowest Ct across rooms), white if no room detected it but at least one returned a valid negative, and grey if every room was invalid. An asterisk beneath the axis marks a session where at least one room's run was invalid and data were not available from all sampled rooms.</w:t>
+      </w:r>
+    </w:p>
+    <w:p>
+      <w:r>
+        <w:rPr>
+          <w:b/>
+        </w:rPr>
+        <w:t>Figure 2.</w:t>
+      </w:r>
+      <w:r>
+        <w:t xml:space="preserve"> </w:t>
+      </w:r>
+      <w:r>
+        <w:rPr>
+          <w:b/>
+        </w:rPr>
+        <w:t>Per-room detections during the Houston sampling period.</w:t>
+      </w:r>
+      <w:r>
+        <w:t xml:space="preserve"> Sampling in Houston ran from the evening of 30 June to 4 July 2026 across four team spaces (physiotherapy room, meal room, equipment room, and a team-occupied hallway). Rows group the four target viruses within each room. White boxes are valid negatives, grey boxes are invalid runs, and blue boxes are detections (fill color mapped to Ct). On 1 July, SARS-CoV-2 was detected in the meal room, physiotherapy room, and hallway, and influenza A in the equipment room. SARS-CoV-2 returned on 3–4 July at lower Ct, most strongly in the meal room.</w:t>
+      </w:r>
+    </w:p>
+    <w:p>
+      <w:r>
+        <w:rPr>
+          <w:b/>
+        </w:rPr>
+        <w:t>Figure 3.</w:t>
+      </w:r>
+      <w:r>
+        <w:t xml:space="preserve"> </w:t>
+      </w:r>
+      <w:r>
+        <w:rPr>
+          <w:b/>
+        </w:rPr>
+        <w:t>Human viruses detected by metagenomic sequencing of the Houston air samples</w:t>
+      </w:r>
+      <w:r>
+        <w:t>. Air cartridges from the Houston team spaces were pulled from the samplers on the afternoon of 4 July 2026 and sequenced, and reads were classified against a curated viral reference database with EsViritu. These cartridges were collected the same day but are not the same cartridges tested on the GeneXpert, so sequencing provides an independent line of evidence for the viruses present in these spaces. Columns are the four sequenced samples, labelled by room, by GeneXpert SARS-CoV-2 status where a same-room GeneXpert result exists, and by the cartridge's sampling runtime in hours and minutes (h:mm). Rows are the human viruses detected, with Merkel cell polyomavirus and SARS-CoV-2 placed at the top and the remaining viruses ordered by total distinct reads across all samples. Each cell reports the number of distinct (deduplicated) reads assigned to that virus in that sample, with fill mapped to that count on a light to deep blue scale, so deeper blue indicates more distinct reads. Merkel cell polyomavirus, a commensal virus of human skin, was found in every sample, consistent with continuous human occupancy. Sequencing additionally recovered respiratory viruses not on the GeneXpert panel, including human coronavirus OC43 and rhinovirus.</w:t>
+      </w:r>
+    </w:p>
+    <w:p>
+      <w:r>
+        <w:rPr>
+          <w:b/>
+        </w:rPr>
+        <w:t>Figure 4.</w:t>
+      </w:r>
+      <w:r>
+        <w:t xml:space="preserve"> </w:t>
+      </w:r>
+      <w:r>
+        <w:rPr>
+          <w:b/>
+        </w:rPr>
+        <w:t>Air sampling for early detection of respiratory-virus threats in an elite team during competition.</w:t>
+      </w:r>
+      <w:r>
+        <w:t xml:space="preserve"> Continuous bioaerosol sampling was performed in up to four team congregate spaces per hotel, typically the meal, equipment, physiotherapy, and coaches' rooms, across five host cities during the 2026 FIFA World Cup™. Each sampler's filter was eluted on-site and tested on a Cepheid GeneXpert SARS-CoV-2/Flu/RSV plus cartridge, giving a same-day, point-of-care result (top). Viral genetic material was detected in team-hotel air in every one of the five cities. The timeline shows sampling coverage as a horizontal band and each viral detection as a vertical tick on a single continuous time axis across the tournament, with detections sparse early and clustered in the final cities (middle). A positive air signal can trigger low-cost, low-regret responses before an outbreak is clinically apparent, such as masking, portable air purifiers, distancing and reduced occupancy, far-UVC lighting, reinforced ventilation, and excluding visibly ill personnel (bottom).</w:t>
+      </w:r>
+    </w:p>
+    <w:p>
+      <w:r>
+        <w:rPr>
+          <w:b/>
+        </w:rPr>
+        <w:t>Supplementary figure legend</w:t>
+      </w:r>
+    </w:p>
+    <w:p>
+      <w:r>
+        <w:rPr>
+          <w:b/>
+        </w:rPr>
+        <w:t>Supplementary Figure S1. Community wastewater surveillance context in each host city over the 2025–2026 respiratory season.</w:t>
+      </w:r>
+      <w:r>
+        <w:t xml:space="preserve"> Each panel (A to E) is one host city, plotting publicly reported municipal wastewater levels for the four study targets (SARS-CoV-2, influenza A, influenza B, and RSV) from August 2025 through mid-July 2026. The shaded gold band marks Team Canada's air-sampling window in that city. The four data sources report non-interchangeable quantities and are each shown on their own independent vertical axis; levels must be read within a panel and not compared between panels. Panels A–C (Montreal, Toronto, Vancouver) use the PHAC wastewater aggregate (PMMoV-normalized index); panel D (Los Angeles) uses the California CDPH/CDC-NWSS JWPCP dataset, self-normalized to fecal load; panel E (Houston) uses the Rice/Houston Health Department 69th Street index. Across all five cities the visit windows fall in the seasonal trough, at or near each site's own lowest values, indicating no host city was experiencing unusually high community respiratory-virus circulation while Team Canada was present.</w:t>
+      </w:r>
+    </w:p>
+    <w:p>
+      <w:r>
+        <w:rPr>
+          <w:b/>
+        </w:rPr>
+        <w:t>Supplementary methods: community wastewater comparison</w:t>
+      </w:r>
+    </w:p>
+    <w:p>
+      <w:r>
+        <w:t>To place the air-sampling detections in the context of community-level respiratory-virus circulation in each host city, we retrieved publicly reported municipal wastewater surveillance data for the four study targets, covering the full 2025–2026 respiratory season (weeks beginning on or after August 1, 2025). For the three Canadian cities we used the Public Health Agency of Canada wastewater aggregate (Government of Canada Health Infobase, [42], accessed July 2026), which reports a PMMoV-normalized viral index for SARS-CoV-2 (measure covN2), influenza A, influenza B, and RSV. Vancouver is reported under the label "Metro Vancouver", and where multiple sub-sites contributed we took the weekly median. For Los Angeles we used the California open wastewater dataset (California Surveillance of Wastewaters Network, California Department of Public Health and CDC National Wastewater Surveillance System, [43], data at [44], accessed July 2026) for the Joint Water Pollution Control Plant (JWPCP, Carson), the treatment plant serving the South Bay including Torrance, California, where the team was housed. Because that source reports absolute concentrations, we self-normalized each target to fecal load by dividing the target concentration (copies/L) by the concurrently reported human fecal marker concentration. Panel E (Houston) uses the Rice University and Houston Health Department dashboard for the 69th Street plant serving the downtown Main Street hotel, reporting the published viral-load index for SARS-CoV-2 only at plant level, scaled so that 100 represents the July 2020 baseline.</w:t>
+      </w:r>
+    </w:p>
+    <w:p>
+      <w:r>
+        <w:t>These four sources report non-interchangeable quantities on different scales, so the data cannot be compared between cities. Instead, each city is plotted on its own, with the team's sampling window marked, and the comparison is strictly within-site, asking whether the levels the team sampled were unusually high relative to that same site's own recent history. Non-detect values in the Canadian aggregate (reported at fixed detection-limit substitution values) were treated as non-detections. Two coverage limits are noted where relevant. At plant level the Houston public feed reports SARS-CoV-2 only and ends June 22, 2026, before the team's stay, and influenza B was not reported at JWPCP during this season. The full per-city season is shown in online supplemental figure 1.</w:t>
       </w:r>
     </w:p>
     <w:p>

</xml_diff>